<commit_message>
generación de doc en pdf y word de ot con botón de --
</commit_message>
<xml_diff>
--- a/public/templates/template_instalaciones.docx
+++ b/public/templates/template_instalaciones.docx
@@ -1,6 +1,6 @@
 
 <file path=word/document.xml><?xml version="1.0" encoding="utf-8"?>
-<w:document xmlns:wpc="http://schemas.microsoft.com/office/word/2010/wordprocessingCanvas" xmlns:cx="http://schemas.microsoft.com/office/drawing/2014/chartex" xmlns:mc="http://schemas.openxmlformats.org/markup-compatibility/2006" xmlns:o="urn:schemas-microsoft-com:office:office" xmlns:r="http://schemas.openxmlformats.org/officeDocument/2006/relationships" xmlns:m="http://schemas.openxmlformats.org/officeDocument/2006/math" xmlns:v="urn:schemas-microsoft-com:vml" xmlns:wp14="http://schemas.microsoft.com/office/word/2010/wordprocessingDrawing" xmlns:wp="http://schemas.openxmlformats.org/drawingml/2006/wordprocessingDrawing" xmlns:w10="urn:schemas-microsoft-com:office:word" xmlns:w="http://schemas.openxmlformats.org/wordprocessingml/2006/main" xmlns:w14="http://schemas.microsoft.com/office/word/2010/wordml" xmlns:w15="http://schemas.microsoft.com/office/word/2012/wordml" xmlns:w16se="http://schemas.microsoft.com/office/word/2015/wordml/symex" xmlns:wpg="http://schemas.microsoft.com/office/word/2010/wordprocessingGroup" xmlns:wpi="http://schemas.microsoft.com/office/word/2010/wordprocessingInk" xmlns:wne="http://schemas.microsoft.com/office/word/2006/wordml" xmlns:wps="http://schemas.microsoft.com/office/word/2010/wordprocessingShape" mc:Ignorable="w14 w15 w16se wp14">
+<w:document xmlns:wpc="http://schemas.microsoft.com/office/word/2010/wordprocessingCanvas" xmlns:cx="http://schemas.microsoft.com/office/drawing/2014/chartex" xmlns:cx1="http://schemas.microsoft.com/office/drawing/2015/9/8/chartex" xmlns:cx2="http://schemas.microsoft.com/office/drawing/2015/10/21/chartex" xmlns:cx3="http://schemas.microsoft.com/office/drawing/2016/5/9/chartex" xmlns:cx4="http://schemas.microsoft.com/office/drawing/2016/5/10/chartex" xmlns:cx5="http://schemas.microsoft.com/office/drawing/2016/5/11/chartex" xmlns:cx6="http://schemas.microsoft.com/office/drawing/2016/5/12/chartex" xmlns:cx7="http://schemas.microsoft.com/office/drawing/2016/5/13/chartex" xmlns:cx8="http://schemas.microsoft.com/office/drawing/2016/5/14/chartex" xmlns:mc="http://schemas.openxmlformats.org/markup-compatibility/2006" xmlns:aink="http://schemas.microsoft.com/office/drawing/2016/ink" xmlns:am3d="http://schemas.microsoft.com/office/drawing/2017/model3d" xmlns:o="urn:schemas-microsoft-com:office:office" xmlns:r="http://schemas.openxmlformats.org/officeDocument/2006/relationships" xmlns:m="http://schemas.openxmlformats.org/officeDocument/2006/math" xmlns:v="urn:schemas-microsoft-com:vml" xmlns:wp14="http://schemas.microsoft.com/office/word/2010/wordprocessingDrawing" xmlns:wp="http://schemas.openxmlformats.org/drawingml/2006/wordprocessingDrawing" xmlns:w10="urn:schemas-microsoft-com:office:word" xmlns:w="http://schemas.openxmlformats.org/wordprocessingml/2006/main" xmlns:w14="http://schemas.microsoft.com/office/word/2010/wordml" xmlns:w15="http://schemas.microsoft.com/office/word/2012/wordml" xmlns:w16cex="http://schemas.microsoft.com/office/word/2018/wordml/cex" xmlns:w16cid="http://schemas.microsoft.com/office/word/2016/wordml/cid" xmlns:w16="http://schemas.microsoft.com/office/word/2018/wordml" xmlns:w16sdtdh="http://schemas.microsoft.com/office/word/2020/wordml/sdtdatahash" xmlns:w16se="http://schemas.microsoft.com/office/word/2015/wordml/symex" xmlns:wpg="http://schemas.microsoft.com/office/word/2010/wordprocessingGroup" xmlns:wpi="http://schemas.microsoft.com/office/word/2010/wordprocessingInk" xmlns:wne="http://schemas.microsoft.com/office/word/2006/wordml" xmlns:wps="http://schemas.microsoft.com/office/word/2010/wordprocessingShape" mc:Ignorable="w14 w15 w16se w16cid w16 w16cex w16sdtdh wp14">
   <w:body>
     <w:p>
       <w:pPr>
@@ -22,7 +22,7 @@
           <w:lang w:eastAsia="es-ES"/>
         </w:rPr>
         <w:drawing>
-          <wp:inline distT="0" distB="0" distL="0" distR="0">
+          <wp:inline distT="0" distB="0" distL="0" distR="0" wp14:anchorId="0DB21CC7" wp14:editId="0506A7CF">
             <wp:extent cx="3026915" cy="403859"/>
             <wp:effectExtent l="0" t="0" r="0" b="0"/>
             <wp:docPr id="1" name="Image 1" descr="http://www.electropuno.com.pe/phpqrcode/Generador/imagenes/LogoTipo.png"/>
@@ -37,7 +37,7 @@
                     <pic:cNvPicPr/>
                   </pic:nvPicPr>
                   <pic:blipFill>
-                    <a:blip r:embed="rId5" cstate="print"/>
+                    <a:blip r:embed="rId7" cstate="print"/>
                     <a:stretch>
                       <a:fillRect/>
                     </a:stretch>
@@ -75,8 +75,8 @@
         <mc:AlternateContent>
           <mc:Choice Requires="wps">
             <w:drawing>
-              <wp:inline distT="0" distB="0" distL="0" distR="0">
-                <wp:extent cx="2289810" cy="253365"/>
+              <wp:inline distT="0" distB="0" distL="0" distR="0" wp14:anchorId="6B605570" wp14:editId="61E24716">
+                <wp:extent cx="2293620" cy="228600"/>
                 <wp:effectExtent l="0" t="0" r="0" b="0"/>
                 <wp:docPr id="2" name="Textbox 2"/>
                 <wp:cNvGraphicFramePr>
@@ -91,7 +91,7 @@
                       <wps:spPr>
                         <a:xfrm>
                           <a:off x="0" y="0"/>
-                          <a:ext cx="2289810" cy="253365"/>
+                          <a:ext cx="2293620" cy="228600"/>
                         </a:xfrm>
                         <a:prstGeom prst="rect">
                           <a:avLst/>
@@ -116,22 +116,21 @@
                               <w:tblLook w:val="01E0" w:firstRow="1" w:lastRow="1" w:firstColumn="1" w:lastColumn="1" w:noHBand="0" w:noVBand="0"/>
                             </w:tblPr>
                             <w:tblGrid>
-                              <w:gridCol w:w="1464"/>
-                              <w:gridCol w:w="2124"/>
+                              <w:gridCol w:w="1800"/>
+                              <w:gridCol w:w="1739"/>
                             </w:tblGrid>
                             <w:tr>
                               <w:trPr>
-                                <w:trHeight w:val="361"/>
+                                <w:trHeight w:val="398"/>
                               </w:trPr>
                               <w:tc>
                                 <w:tcPr>
-                                  <w:tcW w:w="1464" w:type="dxa"/>
+                                  <w:tcW w:w="1800" w:type="dxa"/>
                                 </w:tcPr>
                                 <w:p>
                                   <w:pPr>
                                     <w:pStyle w:val="TableParagraph"/>
                                     <w:spacing w:before="41"/>
-                                    <w:ind w:left="184"/>
                                     <w:rPr>
                                       <w:b/>
                                       <w:sz w:val="23"/>
@@ -154,6 +153,7 @@
                                     </w:rPr>
                                     <w:t xml:space="preserve"> </w:t>
                                   </w:r>
+                                  <w:proofErr w:type="spellStart"/>
                                   <w:r>
                                     <w:rPr>
                                       <w:b/>
@@ -162,10 +162,10 @@
                                     </w:rPr>
                                     <w:t>N°</w:t>
                                   </w:r>
+                                  <w:proofErr w:type="spellEnd"/>
                                   <w:r>
                                     <w:rPr>
                                       <w:b/>
-                                      <w:spacing w:val="-11"/>
                                       <w:w w:val="105"/>
                                       <w:sz w:val="23"/>
                                     </w:rPr>
@@ -174,23 +174,36 @@
                                   <w:r>
                                     <w:rPr>
                                       <w:b/>
-                                      <w:spacing w:val="-5"/>
-                                      <w:w w:val="105"/>
                                       <w:sz w:val="23"/>
                                     </w:rPr>
-                                    <w:t>{{numero_ot}}</w:t>
+                                    <w:t>{{</w:t>
+                                  </w:r>
+                                  <w:proofErr w:type="spellStart"/>
+                                  <w:r>
+                                    <w:rPr>
+                                      <w:b/>
+                                      <w:sz w:val="23"/>
+                                    </w:rPr>
+                                    <w:t>numero_ot</w:t>
+                                  </w:r>
+                                  <w:proofErr w:type="spellEnd"/>
+                                  <w:r>
+                                    <w:rPr>
+                                      <w:b/>
+                                      <w:sz w:val="23"/>
+                                    </w:rPr>
+                                    <w:t>}}</w:t>
                                   </w:r>
                                 </w:p>
                               </w:tc>
                               <w:tc>
                                 <w:tcPr>
-                                  <w:tcW w:w="2124" w:type="dxa"/>
+                                  <w:tcW w:w="1739" w:type="dxa"/>
                                 </w:tcPr>
                                 <w:p>
                                   <w:pPr>
                                     <w:pStyle w:val="TableParagraph"/>
                                     <w:spacing w:before="31"/>
-                                    <w:ind w:left="456"/>
                                     <w:rPr>
                                       <w:b/>
                                       <w:sz w:val="23"/>
@@ -234,12 +247,11 @@
           </mc:Choice>
           <mc:Fallback>
             <w:pict>
-              <v:shapetype id="_x0000_t202" coordsize="21600,21600" o:spt="202" path="m,l,21600r21600,l21600,xe">
+              <v:shapetype w14:anchorId="6B605570" id="_x0000_t202" coordsize="21600,21600" o:spt="202" path="m,l,21600r21600,l21600,xe">
                 <v:stroke joinstyle="miter"/>
                 <v:path gradientshapeok="t" o:connecttype="rect"/>
               </v:shapetype>
-              <v:shape id="Textbox 2" o:spid="_x0000_s1026" type="#_x0000_t202" style="width:180.3pt;height:19.95pt;visibility:visible;mso-wrap-style:square;mso-left-percent:-10001;mso-top-percent:-10001;mso-position-horizontal:absolute;mso-position-horizontal-relative:char;mso-position-vertical:absolute;mso-position-vertical-relative:line;mso-left-percent:-10001;mso-top-percent:-10001;v-text-anchor:top" o:gfxdata="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" filled="f" stroked="f">
-                <v:path arrowok="t"/>
+              <v:shape id="Textbox 2" o:spid="_x0000_s1026" type="#_x0000_t202" style="width:180.6pt;height:18pt;visibility:visible;mso-wrap-style:square;mso-left-percent:-10001;mso-top-percent:-10001;mso-position-horizontal:absolute;mso-position-horizontal-relative:char;mso-position-vertical:absolute;mso-position-vertical-relative:line;mso-left-percent:-10001;mso-top-percent:-10001;v-text-anchor:top" o:gfxdata="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" filled="f" stroked="f">
                 <v:textbox inset="0,0,0,0">
                   <w:txbxContent>
                     <w:tbl>
@@ -259,22 +271,21 @@
                         <w:tblLook w:val="01E0" w:firstRow="1" w:lastRow="1" w:firstColumn="1" w:lastColumn="1" w:noHBand="0" w:noVBand="0"/>
                       </w:tblPr>
                       <w:tblGrid>
-                        <w:gridCol w:w="1464"/>
-                        <w:gridCol w:w="2124"/>
+                        <w:gridCol w:w="1800"/>
+                        <w:gridCol w:w="1739"/>
                       </w:tblGrid>
                       <w:tr>
                         <w:trPr>
-                          <w:trHeight w:val="361"/>
+                          <w:trHeight w:val="398"/>
                         </w:trPr>
                         <w:tc>
                           <w:tcPr>
-                            <w:tcW w:w="1464" w:type="dxa"/>
+                            <w:tcW w:w="1800" w:type="dxa"/>
                           </w:tcPr>
                           <w:p>
                             <w:pPr>
                               <w:pStyle w:val="TableParagraph"/>
                               <w:spacing w:before="41"/>
-                              <w:ind w:left="184"/>
                               <w:rPr>
                                 <w:b/>
                                 <w:sz w:val="23"/>
@@ -297,6 +308,7 @@
                               </w:rPr>
                               <w:t xml:space="preserve"> </w:t>
                             </w:r>
+                            <w:proofErr w:type="spellStart"/>
                             <w:r>
                               <w:rPr>
                                 <w:b/>
@@ -305,10 +317,10 @@
                               </w:rPr>
                               <w:t>N°</w:t>
                             </w:r>
+                            <w:proofErr w:type="spellEnd"/>
                             <w:r>
                               <w:rPr>
                                 <w:b/>
-                                <w:spacing w:val="-11"/>
                                 <w:w w:val="105"/>
                                 <w:sz w:val="23"/>
                               </w:rPr>
@@ -317,23 +329,36 @@
                             <w:r>
                               <w:rPr>
                                 <w:b/>
-                                <w:spacing w:val="-5"/>
-                                <w:w w:val="105"/>
                                 <w:sz w:val="23"/>
                               </w:rPr>
-                              <w:t>{{numero_ot}}</w:t>
+                              <w:t>{{</w:t>
+                            </w:r>
+                            <w:proofErr w:type="spellStart"/>
+                            <w:r>
+                              <w:rPr>
+                                <w:b/>
+                                <w:sz w:val="23"/>
+                              </w:rPr>
+                              <w:t>numero_ot</w:t>
+                            </w:r>
+                            <w:proofErr w:type="spellEnd"/>
+                            <w:r>
+                              <w:rPr>
+                                <w:b/>
+                                <w:sz w:val="23"/>
+                              </w:rPr>
+                              <w:t>}}</w:t>
                             </w:r>
                           </w:p>
                         </w:tc>
                         <w:tc>
                           <w:tcPr>
-                            <w:tcW w:w="2124" w:type="dxa"/>
+                            <w:tcW w:w="1739" w:type="dxa"/>
                           </w:tcPr>
                           <w:p>
                             <w:pPr>
                               <w:pStyle w:val="TableParagraph"/>
                               <w:spacing w:before="31"/>
-                              <w:ind w:left="456"/>
                               <w:rPr>
                                 <w:b/>
                                 <w:sz w:val="23"/>
@@ -387,23 +412,6 @@
         </w:rPr>
         <w:t>Contrato {{contrato}}</w:t>
       </w:r>
-      <w:r>
-        <w:rPr>
-          <w:spacing w:val="21"/>
-          <w:sz w:val="20"/>
-        </w:rPr>
-      </w:r>
-      <w:r>
-        <w:rPr>
-          <w:sz w:val="20"/>
-        </w:rPr>
-      </w:r>
-      <w:r>
-        <w:rPr>
-          <w:spacing w:val="-2"/>
-          <w:sz w:val="20"/>
-        </w:rPr>
-      </w:r>
     </w:p>
     <w:p>
       <w:pPr>
@@ -513,7 +521,7 @@
         <mc:AlternateContent>
           <mc:Choice Requires="wps">
             <w:drawing>
-              <wp:anchor distT="0" distB="0" distL="0" distR="0" simplePos="0" relativeHeight="15728640" behindDoc="0" locked="0" layoutInCell="1" allowOverlap="1">
+              <wp:anchor distT="0" distB="0" distL="0" distR="0" simplePos="0" relativeHeight="15728640" behindDoc="0" locked="0" layoutInCell="1" allowOverlap="1" wp14:anchorId="34E9F17B" wp14:editId="0DE1CF75">
                 <wp:simplePos x="0" y="0"/>
                 <wp:positionH relativeFrom="page">
                   <wp:posOffset>6670293</wp:posOffset>
@@ -548,7 +556,7 @@
                           <w:tbl>
                             <w:tblPr>
                               <w:tblStyle w:val="TableNormal"/>
-                              <w:tblW w:w="0" w:type="auto"/>
+                              <w:tblW w:w="4456" w:type="dxa"/>
                               <w:tblInd w:w="82" w:type="dxa"/>
                               <w:tblBorders>
                                 <w:top w:val="single" w:sz="18" w:space="0" w:color="000000"/>
@@ -562,22 +570,21 @@
                               <w:tblLook w:val="01E0" w:firstRow="1" w:lastRow="1" w:firstColumn="1" w:lastColumn="1" w:noHBand="0" w:noVBand="0"/>
                             </w:tblPr>
                             <w:tblGrid>
-                              <w:gridCol w:w="2000"/>
-                              <w:gridCol w:w="2494"/>
+                              <w:gridCol w:w="1983"/>
+                              <w:gridCol w:w="2473"/>
                             </w:tblGrid>
                             <w:tr>
                               <w:trPr>
-                                <w:trHeight w:val="497"/>
+                                <w:trHeight w:val="289"/>
                               </w:trPr>
                               <w:tc>
                                 <w:tcPr>
-                                  <w:tcW w:w="2000" w:type="dxa"/>
+                                  <w:tcW w:w="1983" w:type="dxa"/>
                                 </w:tcPr>
                                 <w:p>
                                   <w:pPr>
                                     <w:pStyle w:val="TableParagraph"/>
                                     <w:spacing w:before="118"/>
-                                    <w:ind w:left="337"/>
                                     <w:rPr>
                                       <w:b/>
                                       <w:sz w:val="20"/>
@@ -625,7 +632,7 @@
                               </w:tc>
                               <w:tc>
                                 <w:tcPr>
-                                  <w:tcW w:w="2494" w:type="dxa"/>
+                                  <w:tcW w:w="2473" w:type="dxa"/>
                                 </w:tcPr>
                                 <w:p>
                                   <w:pPr>
@@ -669,14 +676,13 @@
           </mc:Choice>
           <mc:Fallback>
             <w:pict>
-              <v:shape id="Textbox 3" o:spid="_x0000_s1027" type="#_x0000_t202" style="position:absolute;left:0;text-align:left;margin-left:525.2pt;margin-top:3.7pt;width:232.35pt;height:29.35pt;z-index:15728640;visibility:visible;mso-wrap-style:square;mso-wrap-distance-left:0;mso-wrap-distance-top:0;mso-wrap-distance-right:0;mso-wrap-distance-bottom:0;mso-position-horizontal:absolute;mso-position-horizontal-relative:page;mso-position-vertical:absolute;mso-position-vertical-relative:text;v-text-anchor:top" o:gfxdata="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" filled="f" stroked="f">
-                <v:path arrowok="t"/>
+              <v:shape w14:anchorId="34E9F17B" id="Textbox 3" o:spid="_x0000_s1027" type="#_x0000_t202" style="position:absolute;left:0;text-align:left;margin-left:525.2pt;margin-top:3.7pt;width:232.35pt;height:29.35pt;z-index:15728640;visibility:visible;mso-wrap-style:square;mso-wrap-distance-left:0;mso-wrap-distance-top:0;mso-wrap-distance-right:0;mso-wrap-distance-bottom:0;mso-position-horizontal:absolute;mso-position-horizontal-relative:page;mso-position-vertical:absolute;mso-position-vertical-relative:text;v-text-anchor:top" o:gfxdata="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" filled="f" stroked="f">
                 <v:textbox inset="0,0,0,0">
                   <w:txbxContent>
                     <w:tbl>
                       <w:tblPr>
                         <w:tblStyle w:val="TableNormal"/>
-                        <w:tblW w:w="0" w:type="auto"/>
+                        <w:tblW w:w="4456" w:type="dxa"/>
                         <w:tblInd w:w="82" w:type="dxa"/>
                         <w:tblBorders>
                           <w:top w:val="single" w:sz="18" w:space="0" w:color="000000"/>
@@ -690,22 +696,21 @@
                         <w:tblLook w:val="01E0" w:firstRow="1" w:lastRow="1" w:firstColumn="1" w:lastColumn="1" w:noHBand="0" w:noVBand="0"/>
                       </w:tblPr>
                       <w:tblGrid>
-                        <w:gridCol w:w="2000"/>
-                        <w:gridCol w:w="2494"/>
+                        <w:gridCol w:w="1983"/>
+                        <w:gridCol w:w="2473"/>
                       </w:tblGrid>
                       <w:tr>
                         <w:trPr>
-                          <w:trHeight w:val="497"/>
+                          <w:trHeight w:val="289"/>
                         </w:trPr>
                         <w:tc>
                           <w:tcPr>
-                            <w:tcW w:w="2000" w:type="dxa"/>
+                            <w:tcW w:w="1983" w:type="dxa"/>
                           </w:tcPr>
                           <w:p>
                             <w:pPr>
                               <w:pStyle w:val="TableParagraph"/>
                               <w:spacing w:before="118"/>
-                              <w:ind w:left="337"/>
                               <w:rPr>
                                 <w:b/>
                                 <w:sz w:val="20"/>
@@ -753,7 +758,7 @@
                         </w:tc>
                         <w:tc>
                           <w:tcPr>
-                            <w:tcW w:w="2494" w:type="dxa"/>
+                            <w:tcW w:w="2473" w:type="dxa"/>
                           </w:tcPr>
                           <w:p>
                             <w:pPr>
@@ -905,77 +910,14 @@
       </w:pPr>
       <w:r>
         <w:t>EDITADO POR</w:t>
+      </w:r>
+      <w:r>
         <w:tab/>
         <w:t>:</w:t>
+      </w:r>
+      <w:r>
         <w:tab/>
         <w:t>{{editado_por}}</w:t>
-      </w:r>
-      <w:r>
-        <w:rPr>
-          <w:spacing w:val="12"/>
-        </w:rPr>
-      </w:r>
-      <w:r>
-        <w:rPr>
-          <w:spacing w:val="-5"/>
-        </w:rPr>
-      </w:r>
-      <w:r/>
-      <w:r>
-        <w:rPr>
-          <w:spacing w:val="-10"/>
-        </w:rPr>
-      </w:r>
-      <w:r/>
-      <w:r>
-        <w:rPr>
-          <w:color w:val="0000FF"/>
-        </w:rPr>
-      </w:r>
-      <w:r>
-        <w:rPr>
-          <w:color w:val="0000FF"/>
-          <w:spacing w:val="13"/>
-        </w:rPr>
-      </w:r>
-      <w:r>
-        <w:rPr>
-          <w:color w:val="0000FF"/>
-        </w:rPr>
-      </w:r>
-      <w:r>
-        <w:rPr>
-          <w:color w:val="0000FF"/>
-          <w:spacing w:val="10"/>
-        </w:rPr>
-      </w:r>
-      <w:r>
-        <w:rPr>
-          <w:color w:val="0000FF"/>
-        </w:rPr>
-      </w:r>
-      <w:r>
-        <w:rPr>
-          <w:color w:val="0000FF"/>
-          <w:spacing w:val="11"/>
-        </w:rPr>
-      </w:r>
-      <w:r>
-        <w:rPr>
-          <w:color w:val="0000FF"/>
-        </w:rPr>
-      </w:r>
-      <w:r>
-        <w:rPr>
-          <w:color w:val="0000FF"/>
-          <w:spacing w:val="10"/>
-        </w:rPr>
-      </w:r>
-      <w:r>
-        <w:rPr>
-          <w:color w:val="0000FF"/>
-          <w:spacing w:val="-2"/>
-        </w:rPr>
       </w:r>
     </w:p>
     <w:p>
@@ -1630,6 +1572,14 @@
                 <w:sz w:val="18"/>
               </w:rPr>
             </w:pPr>
+            <w:r>
+              <w:rPr>
+                <w:b/>
+                <w:w w:val="105"/>
+                <w:sz w:val="18"/>
+              </w:rPr>
+              <w:t>{{</w:t>
+            </w:r>
             <w:proofErr w:type="spellStart"/>
             <w:r>
               <w:rPr>
@@ -1637,9 +1587,17 @@
                 <w:w w:val="105"/>
                 <w:sz w:val="18"/>
               </w:rPr>
-              <w:t>{{fi_fact}}</w:t>
+              <w:t>fi_fact</w:t>
             </w:r>
             <w:proofErr w:type="spellEnd"/>
+            <w:r>
+              <w:rPr>
+                <w:b/>
+                <w:w w:val="105"/>
+                <w:sz w:val="18"/>
+              </w:rPr>
+              <w:t>}}</w:t>
+            </w:r>
           </w:p>
         </w:tc>
         <w:tc>
@@ -1656,6 +1614,14 @@
                 <w:sz w:val="18"/>
               </w:rPr>
             </w:pPr>
+            <w:r>
+              <w:rPr>
+                <w:b/>
+                <w:w w:val="105"/>
+                <w:sz w:val="18"/>
+              </w:rPr>
+              <w:t>{{</w:t>
+            </w:r>
             <w:proofErr w:type="spellStart"/>
             <w:r>
               <w:rPr>
@@ -1663,9 +1629,17 @@
                 <w:w w:val="105"/>
                 <w:sz w:val="18"/>
               </w:rPr>
-              <w:t>{{ff_fact}}</w:t>
+              <w:t>ff_fact</w:t>
             </w:r>
             <w:proofErr w:type="spellEnd"/>
+            <w:r>
+              <w:rPr>
+                <w:b/>
+                <w:w w:val="105"/>
+                <w:sz w:val="18"/>
+              </w:rPr>
+              <w:t>}}</w:t>
+            </w:r>
           </w:p>
         </w:tc>
         <w:tc>
@@ -1683,6 +1657,14 @@
                 <w:sz w:val="18"/>
               </w:rPr>
             </w:pPr>
+            <w:r>
+              <w:rPr>
+                <w:b/>
+                <w:w w:val="105"/>
+                <w:sz w:val="18"/>
+              </w:rPr>
+              <w:t>{{</w:t>
+            </w:r>
             <w:proofErr w:type="spellStart"/>
             <w:r>
               <w:rPr>
@@ -1690,9 +1672,17 @@
                 <w:w w:val="105"/>
                 <w:sz w:val="18"/>
               </w:rPr>
-              <w:t>{{fl_fact}}</w:t>
+              <w:t>fl_fact</w:t>
             </w:r>
             <w:proofErr w:type="spellEnd"/>
+            <w:r>
+              <w:rPr>
+                <w:b/>
+                <w:w w:val="105"/>
+                <w:sz w:val="18"/>
+              </w:rPr>
+              <w:t>}}</w:t>
+            </w:r>
           </w:p>
         </w:tc>
         <w:tc>
@@ -1912,6 +1902,14 @@
                 <w:sz w:val="18"/>
               </w:rPr>
             </w:pPr>
+            <w:r>
+              <w:rPr>
+                <w:b/>
+                <w:w w:val="105"/>
+                <w:sz w:val="18"/>
+              </w:rPr>
+              <w:t>{{</w:t>
+            </w:r>
             <w:proofErr w:type="spellStart"/>
             <w:r>
               <w:rPr>
@@ -1919,9 +1917,17 @@
                 <w:w w:val="105"/>
                 <w:sz w:val="18"/>
               </w:rPr>
-              <w:t>{{fi_inst}}</w:t>
+              <w:t>fi_inst</w:t>
             </w:r>
             <w:proofErr w:type="spellEnd"/>
+            <w:r>
+              <w:rPr>
+                <w:b/>
+                <w:w w:val="105"/>
+                <w:sz w:val="18"/>
+              </w:rPr>
+              <w:t>}}</w:t>
+            </w:r>
           </w:p>
         </w:tc>
         <w:tc>
@@ -1939,6 +1945,14 @@
                 <w:sz w:val="18"/>
               </w:rPr>
             </w:pPr>
+            <w:r>
+              <w:rPr>
+                <w:b/>
+                <w:w w:val="105"/>
+                <w:sz w:val="18"/>
+              </w:rPr>
+              <w:t>{{</w:t>
+            </w:r>
             <w:proofErr w:type="spellStart"/>
             <w:r>
               <w:rPr>
@@ -1946,9 +1960,17 @@
                 <w:w w:val="105"/>
                 <w:sz w:val="18"/>
               </w:rPr>
-              <w:t>{{ff_inst}}</w:t>
+              <w:t>ff_inst</w:t>
             </w:r>
             <w:proofErr w:type="spellEnd"/>
+            <w:r>
+              <w:rPr>
+                <w:b/>
+                <w:w w:val="105"/>
+                <w:sz w:val="18"/>
+              </w:rPr>
+              <w:t>}}</w:t>
+            </w:r>
           </w:p>
         </w:tc>
         <w:tc>
@@ -1966,6 +1988,14 @@
                 <w:sz w:val="18"/>
               </w:rPr>
             </w:pPr>
+            <w:r>
+              <w:rPr>
+                <w:b/>
+                <w:w w:val="105"/>
+                <w:sz w:val="18"/>
+              </w:rPr>
+              <w:t>{{</w:t>
+            </w:r>
             <w:proofErr w:type="spellStart"/>
             <w:r>
               <w:rPr>
@@ -1973,9 +2003,17 @@
                 <w:w w:val="105"/>
                 <w:sz w:val="18"/>
               </w:rPr>
-              <w:t>{{fl_inst}}</w:t>
+              <w:t>fl_inst</w:t>
             </w:r>
             <w:proofErr w:type="spellEnd"/>
+            <w:r>
+              <w:rPr>
+                <w:b/>
+                <w:w w:val="105"/>
+                <w:sz w:val="18"/>
+              </w:rPr>
+              <w:t>}}</w:t>
+            </w:r>
           </w:p>
         </w:tc>
         <w:tc>
@@ -3017,35 +3055,7 @@
           <w:sz w:val="20"/>
           <w:szCs w:val="20"/>
         </w:rPr>
-        <w:t xml:space="preserve">de encontrar </w:t>
-      </w:r>
-      <w:proofErr w:type="spellStart"/>
-      <w:r>
-        <w:rPr>
-          <w:w w:val="105"/>
-          <w:sz w:val="20"/>
-          <w:szCs w:val="20"/>
-        </w:rPr>
-        <w:t>Osinergmin</w:t>
-      </w:r>
-      <w:proofErr w:type="spellEnd"/>
-      <w:r>
-        <w:rPr>
-          <w:w w:val="105"/>
-          <w:sz w:val="20"/>
-          <w:szCs w:val="20"/>
-        </w:rPr>
-        <w:t xml:space="preserve"> asumirá Consorcio San Pedro la </w:t>
-      </w:r>
-      <w:bookmarkStart w:id="0" w:name="_GoBack"/>
-      <w:bookmarkEnd w:id="0"/>
-      <w:r>
-        <w:rPr>
-          <w:w w:val="105"/>
-          <w:sz w:val="20"/>
-          <w:szCs w:val="20"/>
-        </w:rPr>
-        <w:t>totalidad de las multas impuestas a ELECTROPUNO S.A.A.</w:t>
+        <w:t>de encontrar Osinergmin asumirá Consorcio San Pedro la totalidad de las multas impuestas a ELECTROPUNO S.A.A.</w:t>
       </w:r>
     </w:p>
     <w:p>
@@ -3905,6 +3915,7 @@
         </w:rPr>
         <w:t xml:space="preserve"> </w:t>
       </w:r>
+      <w:proofErr w:type="gramStart"/>
       <w:r>
         <w:rPr>
           <w:w w:val="105"/>
@@ -3930,6 +3941,7 @@
         </w:rPr>
         <w:t>programados</w:t>
       </w:r>
+      <w:proofErr w:type="gramEnd"/>
       <w:r>
         <w:rPr>
           <w:spacing w:val="-6"/>
@@ -4977,15 +4989,7 @@
           <w:sz w:val="20"/>
           <w:szCs w:val="20"/>
         </w:rPr>
-        <w:t>e</w:t>
-      </w:r>
-      <w:r>
-        <w:rPr>
-          <w:w w:val="105"/>
-          <w:sz w:val="20"/>
-          <w:szCs w:val="20"/>
-        </w:rPr>
-        <w:t>jecutados</w:t>
+        <w:t>ejecutados</w:t>
       </w:r>
       <w:r>
         <w:rPr>
@@ -5530,7 +5534,6 @@
         </w:rPr>
         <w:t xml:space="preserve"> </w:t>
       </w:r>
-      <w:proofErr w:type="spellStart"/>
       <w:r>
         <w:rPr>
           <w:w w:val="105"/>
@@ -5539,7 +5542,6 @@
         </w:rPr>
         <w:t>muestral</w:t>
       </w:r>
-      <w:proofErr w:type="spellEnd"/>
       <w:r>
         <w:rPr>
           <w:spacing w:val="-7"/>
@@ -6035,18 +6037,52 @@
 </w:document>
 </file>
 
+<file path=word/endnotes.xml><?xml version="1.0" encoding="utf-8"?>
+<w:endnotes xmlns:wpc="http://schemas.microsoft.com/office/word/2010/wordprocessingCanvas" xmlns:cx="http://schemas.microsoft.com/office/drawing/2014/chartex" xmlns:cx1="http://schemas.microsoft.com/office/drawing/2015/9/8/chartex" xmlns:cx2="http://schemas.microsoft.com/office/drawing/2015/10/21/chartex" xmlns:cx3="http://schemas.microsoft.com/office/drawing/2016/5/9/chartex" xmlns:cx4="http://schemas.microsoft.com/office/drawing/2016/5/10/chartex" xmlns:cx5="http://schemas.microsoft.com/office/drawing/2016/5/11/chartex" xmlns:cx6="http://schemas.microsoft.com/office/drawing/2016/5/12/chartex" xmlns:cx7="http://schemas.microsoft.com/office/drawing/2016/5/13/chartex" xmlns:cx8="http://schemas.microsoft.com/office/drawing/2016/5/14/chartex" xmlns:mc="http://schemas.openxmlformats.org/markup-compatibility/2006" xmlns:aink="http://schemas.microsoft.com/office/drawing/2016/ink" xmlns:am3d="http://schemas.microsoft.com/office/drawing/2017/model3d" xmlns:o="urn:schemas-microsoft-com:office:office" xmlns:r="http://schemas.openxmlformats.org/officeDocument/2006/relationships" xmlns:m="http://schemas.openxmlformats.org/officeDocument/2006/math" xmlns:v="urn:schemas-microsoft-com:vml" xmlns:wp14="http://schemas.microsoft.com/office/word/2010/wordprocessingDrawing" xmlns:wp="http://schemas.openxmlformats.org/drawingml/2006/wordprocessingDrawing" xmlns:w10="urn:schemas-microsoft-com:office:word" xmlns:w="http://schemas.openxmlformats.org/wordprocessingml/2006/main" xmlns:w14="http://schemas.microsoft.com/office/word/2010/wordml" xmlns:w15="http://schemas.microsoft.com/office/word/2012/wordml" xmlns:w16cex="http://schemas.microsoft.com/office/word/2018/wordml/cex" xmlns:w16cid="http://schemas.microsoft.com/office/word/2016/wordml/cid" xmlns:w16="http://schemas.microsoft.com/office/word/2018/wordml" xmlns:w16sdtdh="http://schemas.microsoft.com/office/word/2020/wordml/sdtdatahash" xmlns:w16se="http://schemas.microsoft.com/office/word/2015/wordml/symex" xmlns:wpg="http://schemas.microsoft.com/office/word/2010/wordprocessingGroup" xmlns:wpi="http://schemas.microsoft.com/office/word/2010/wordprocessingInk" xmlns:wne="http://schemas.microsoft.com/office/word/2006/wordml" xmlns:wps="http://schemas.microsoft.com/office/word/2010/wordprocessingShape" mc:Ignorable="w14 w15 w16se w16cid w16 w16cex w16sdtdh wp14">
+  <w:endnote w:type="separator" w:id="-1">
+    <w:p>
+      <w:r>
+        <w:separator/>
+      </w:r>
+    </w:p>
+  </w:endnote>
+  <w:endnote w:type="continuationSeparator" w:id="0">
+    <w:p>
+      <w:r>
+        <w:continuationSeparator/>
+      </w:r>
+    </w:p>
+  </w:endnote>
+</w:endnotes>
+</file>
+
+<file path=word/footnotes.xml><?xml version="1.0" encoding="utf-8"?>
+<w:footnotes xmlns:wpc="http://schemas.microsoft.com/office/word/2010/wordprocessingCanvas" xmlns:cx="http://schemas.microsoft.com/office/drawing/2014/chartex" xmlns:cx1="http://schemas.microsoft.com/office/drawing/2015/9/8/chartex" xmlns:cx2="http://schemas.microsoft.com/office/drawing/2015/10/21/chartex" xmlns:cx3="http://schemas.microsoft.com/office/drawing/2016/5/9/chartex" xmlns:cx4="http://schemas.microsoft.com/office/drawing/2016/5/10/chartex" xmlns:cx5="http://schemas.microsoft.com/office/drawing/2016/5/11/chartex" xmlns:cx6="http://schemas.microsoft.com/office/drawing/2016/5/12/chartex" xmlns:cx7="http://schemas.microsoft.com/office/drawing/2016/5/13/chartex" xmlns:cx8="http://schemas.microsoft.com/office/drawing/2016/5/14/chartex" xmlns:mc="http://schemas.openxmlformats.org/markup-compatibility/2006" xmlns:aink="http://schemas.microsoft.com/office/drawing/2016/ink" xmlns:am3d="http://schemas.microsoft.com/office/drawing/2017/model3d" xmlns:o="urn:schemas-microsoft-com:office:office" xmlns:r="http://schemas.openxmlformats.org/officeDocument/2006/relationships" xmlns:m="http://schemas.openxmlformats.org/officeDocument/2006/math" xmlns:v="urn:schemas-microsoft-com:vml" xmlns:wp14="http://schemas.microsoft.com/office/word/2010/wordprocessingDrawing" xmlns:wp="http://schemas.openxmlformats.org/drawingml/2006/wordprocessingDrawing" xmlns:w10="urn:schemas-microsoft-com:office:word" xmlns:w="http://schemas.openxmlformats.org/wordprocessingml/2006/main" xmlns:w14="http://schemas.microsoft.com/office/word/2010/wordml" xmlns:w15="http://schemas.microsoft.com/office/word/2012/wordml" xmlns:w16cex="http://schemas.microsoft.com/office/word/2018/wordml/cex" xmlns:w16cid="http://schemas.microsoft.com/office/word/2016/wordml/cid" xmlns:w16="http://schemas.microsoft.com/office/word/2018/wordml" xmlns:w16sdtdh="http://schemas.microsoft.com/office/word/2020/wordml/sdtdatahash" xmlns:w16se="http://schemas.microsoft.com/office/word/2015/wordml/symex" xmlns:wpg="http://schemas.microsoft.com/office/word/2010/wordprocessingGroup" xmlns:wpi="http://schemas.microsoft.com/office/word/2010/wordprocessingInk" xmlns:wne="http://schemas.microsoft.com/office/word/2006/wordml" xmlns:wps="http://schemas.microsoft.com/office/word/2010/wordprocessingShape" mc:Ignorable="w14 w15 w16se w16cid w16 w16cex w16sdtdh wp14">
+  <w:footnote w:type="separator" w:id="-1">
+    <w:p>
+      <w:r>
+        <w:separator/>
+      </w:r>
+    </w:p>
+  </w:footnote>
+  <w:footnote w:type="continuationSeparator" w:id="0">
+    <w:p>
+      <w:r>
+        <w:continuationSeparator/>
+      </w:r>
+    </w:p>
+  </w:footnote>
+</w:footnotes>
+</file>
+
 <file path=word/header1.xml><?xml version="1.0" encoding="utf-8"?>
-<w:hdr xmlns:m="http://schemas.openxmlformats.org/officeDocument/2006/math" xmlns:mc="http://schemas.openxmlformats.org/markup-compatibility/2006" xmlns:mo="http://schemas.microsoft.com/office/mac/office/2008/main" xmlns:mv="urn:schemas-microsoft-com:mac:vml" xmlns:o="urn:schemas-microsoft-com:office:office" xmlns:r="http://schemas.openxmlformats.org/officeDocument/2006/relationships" xmlns:v="urn:schemas-microsoft-com:vml" xmlns:w10="urn:schemas-microsoft-com:office:word" xmlns:w14="http://schemas.microsoft.com/office/word/2010/wordml" xmlns:w="http://schemas.openxmlformats.org/wordprocessingml/2006/main" xmlns:wne="http://schemas.microsoft.com/office/word/2006/wordml" xmlns:wp14="http://schemas.microsoft.com/office/word/2010/wordprocessingDrawing" xmlns:wp="http://schemas.openxmlformats.org/drawingml/2006/wordprocessingDrawing" xmlns:wpc="http://schemas.microsoft.com/office/word/2010/wordprocessingCanvas" xmlns:wpg="http://schemas.microsoft.com/office/word/2010/wordprocessingGroup" xmlns:wpi="http://schemas.microsoft.com/office/word/2010/wordprocessingInk" xmlns:wps="http://schemas.microsoft.com/office/word/2010/wordprocessingShape" mc:Ignorable="w14 wp14">
-  <w:p>
-    <w:pPr>
-      <w:pStyle w:val="Header"/>
-    </w:pPr>
-  </w:p>
+<w:hdr xmlns:wpc="http://schemas.microsoft.com/office/word/2010/wordprocessingCanvas" xmlns:cx="http://schemas.microsoft.com/office/drawing/2014/chartex" xmlns:cx1="http://schemas.microsoft.com/office/drawing/2015/9/8/chartex" xmlns:cx2="http://schemas.microsoft.com/office/drawing/2015/10/21/chartex" xmlns:cx3="http://schemas.microsoft.com/office/drawing/2016/5/9/chartex" xmlns:cx4="http://schemas.microsoft.com/office/drawing/2016/5/10/chartex" xmlns:cx5="http://schemas.microsoft.com/office/drawing/2016/5/11/chartex" xmlns:cx6="http://schemas.microsoft.com/office/drawing/2016/5/12/chartex" xmlns:cx7="http://schemas.microsoft.com/office/drawing/2016/5/13/chartex" xmlns:cx8="http://schemas.microsoft.com/office/drawing/2016/5/14/chartex" xmlns:mc="http://schemas.openxmlformats.org/markup-compatibility/2006" xmlns:aink="http://schemas.microsoft.com/office/drawing/2016/ink" xmlns:am3d="http://schemas.microsoft.com/office/drawing/2017/model3d" xmlns:o="urn:schemas-microsoft-com:office:office" xmlns:r="http://schemas.openxmlformats.org/officeDocument/2006/relationships" xmlns:m="http://schemas.openxmlformats.org/officeDocument/2006/math" xmlns:v="urn:schemas-microsoft-com:vml" xmlns:wp14="http://schemas.microsoft.com/office/word/2010/wordprocessingDrawing" xmlns:wp="http://schemas.openxmlformats.org/drawingml/2006/wordprocessingDrawing" xmlns:w10="urn:schemas-microsoft-com:office:word" xmlns:w="http://schemas.openxmlformats.org/wordprocessingml/2006/main" xmlns:w14="http://schemas.microsoft.com/office/word/2010/wordml" xmlns:w15="http://schemas.microsoft.com/office/word/2012/wordml" xmlns:w16cex="http://schemas.microsoft.com/office/word/2018/wordml/cex" xmlns:w16cid="http://schemas.microsoft.com/office/word/2016/wordml/cid" xmlns:w16="http://schemas.microsoft.com/office/word/2018/wordml" xmlns:w16sdtdh="http://schemas.microsoft.com/office/word/2020/wordml/sdtdatahash" xmlns:w16se="http://schemas.microsoft.com/office/word/2015/wordml/symex" xmlns:wpg="http://schemas.microsoft.com/office/word/2010/wordprocessingGroup" xmlns:wpi="http://schemas.microsoft.com/office/word/2010/wordprocessingInk" xmlns:wne="http://schemas.microsoft.com/office/word/2006/wordml" xmlns:wps="http://schemas.microsoft.com/office/word/2010/wordprocessingShape" mc:Ignorable="w14 w15 w16se w16cid w16 w16cex w16sdtdh wp14">
+  <w:p/>
 </w:hdr>
 </file>
 
 <file path=word/numbering.xml><?xml version="1.0" encoding="utf-8"?>
-<w:numbering xmlns:wpc="http://schemas.microsoft.com/office/word/2010/wordprocessingCanvas" xmlns:cx="http://schemas.microsoft.com/office/drawing/2014/chartex" xmlns:mc="http://schemas.openxmlformats.org/markup-compatibility/2006" xmlns:o="urn:schemas-microsoft-com:office:office" xmlns:r="http://schemas.openxmlformats.org/officeDocument/2006/relationships" xmlns:m="http://schemas.openxmlformats.org/officeDocument/2006/math" xmlns:v="urn:schemas-microsoft-com:vml" xmlns:wp14="http://schemas.microsoft.com/office/word/2010/wordprocessingDrawing" xmlns:wp="http://schemas.openxmlformats.org/drawingml/2006/wordprocessingDrawing" xmlns:w10="urn:schemas-microsoft-com:office:word" xmlns:w="http://schemas.openxmlformats.org/wordprocessingml/2006/main" xmlns:w14="http://schemas.microsoft.com/office/word/2010/wordml" xmlns:w15="http://schemas.microsoft.com/office/word/2012/wordml" xmlns:w16se="http://schemas.microsoft.com/office/word/2015/wordml/symex" xmlns:wpg="http://schemas.microsoft.com/office/word/2010/wordprocessingGroup" xmlns:wpi="http://schemas.microsoft.com/office/word/2010/wordprocessingInk" xmlns:wne="http://schemas.microsoft.com/office/word/2006/wordml" xmlns:wps="http://schemas.microsoft.com/office/word/2010/wordprocessingShape" mc:Ignorable="w14 w15 w16se wp14">
+<w:numbering xmlns:wpc="http://schemas.microsoft.com/office/word/2010/wordprocessingCanvas" xmlns:cx="http://schemas.microsoft.com/office/drawing/2014/chartex" xmlns:cx1="http://schemas.microsoft.com/office/drawing/2015/9/8/chartex" xmlns:cx2="http://schemas.microsoft.com/office/drawing/2015/10/21/chartex" xmlns:cx3="http://schemas.microsoft.com/office/drawing/2016/5/9/chartex" xmlns:cx4="http://schemas.microsoft.com/office/drawing/2016/5/10/chartex" xmlns:cx5="http://schemas.microsoft.com/office/drawing/2016/5/11/chartex" xmlns:cx6="http://schemas.microsoft.com/office/drawing/2016/5/12/chartex" xmlns:cx7="http://schemas.microsoft.com/office/drawing/2016/5/13/chartex" xmlns:cx8="http://schemas.microsoft.com/office/drawing/2016/5/14/chartex" xmlns:mc="http://schemas.openxmlformats.org/markup-compatibility/2006" xmlns:aink="http://schemas.microsoft.com/office/drawing/2016/ink" xmlns:am3d="http://schemas.microsoft.com/office/drawing/2017/model3d" xmlns:o="urn:schemas-microsoft-com:office:office" xmlns:r="http://schemas.openxmlformats.org/officeDocument/2006/relationships" xmlns:m="http://schemas.openxmlformats.org/officeDocument/2006/math" xmlns:v="urn:schemas-microsoft-com:vml" xmlns:wp14="http://schemas.microsoft.com/office/word/2010/wordprocessingDrawing" xmlns:wp="http://schemas.openxmlformats.org/drawingml/2006/wordprocessingDrawing" xmlns:w10="urn:schemas-microsoft-com:office:word" xmlns:w="http://schemas.openxmlformats.org/wordprocessingml/2006/main" xmlns:w14="http://schemas.microsoft.com/office/word/2010/wordml" xmlns:w15="http://schemas.microsoft.com/office/word/2012/wordml" xmlns:w16cex="http://schemas.microsoft.com/office/word/2018/wordml/cex" xmlns:w16cid="http://schemas.microsoft.com/office/word/2016/wordml/cid" xmlns:w16="http://schemas.microsoft.com/office/word/2018/wordml" xmlns:w16sdtdh="http://schemas.microsoft.com/office/word/2020/wordml/sdtdatahash" xmlns:w16se="http://schemas.microsoft.com/office/word/2015/wordml/symex" xmlns:wpg="http://schemas.microsoft.com/office/word/2010/wordprocessingGroup" xmlns:wpi="http://schemas.microsoft.com/office/word/2010/wordprocessingInk" xmlns:wne="http://schemas.microsoft.com/office/word/2006/wordml" xmlns:wps="http://schemas.microsoft.com/office/word/2010/wordprocessingShape" mc:Ignorable="w14 w15 w16se w16cid w16 w16cex w16sdtdh wp14">
   <w:abstractNum w:abstractNumId="0" w15:restartNumberingAfterBreak="0">
     <w:nsid w:val="08012D6C"/>
     <w:multiLevelType w:val="hybridMultilevel"/>
@@ -6303,7 +6339,7 @@
 </file>
 
 <file path=word/styles.xml><?xml version="1.0" encoding="utf-8"?>
-<w:styles xmlns:mc="http://schemas.openxmlformats.org/markup-compatibility/2006" xmlns:r="http://schemas.openxmlformats.org/officeDocument/2006/relationships" xmlns:w="http://schemas.openxmlformats.org/wordprocessingml/2006/main" xmlns:w14="http://schemas.microsoft.com/office/word/2010/wordml" xmlns:w15="http://schemas.microsoft.com/office/word/2012/wordml" xmlns:w16se="http://schemas.microsoft.com/office/word/2015/wordml/symex" mc:Ignorable="w14 w15 w16se">
+<w:styles xmlns:mc="http://schemas.openxmlformats.org/markup-compatibility/2006" xmlns:r="http://schemas.openxmlformats.org/officeDocument/2006/relationships" xmlns:w="http://schemas.openxmlformats.org/wordprocessingml/2006/main" xmlns:w14="http://schemas.microsoft.com/office/word/2010/wordml" xmlns:w15="http://schemas.microsoft.com/office/word/2012/wordml" xmlns:w16cex="http://schemas.microsoft.com/office/word/2018/wordml/cex" xmlns:w16cid="http://schemas.microsoft.com/office/word/2016/wordml/cid" xmlns:w16="http://schemas.microsoft.com/office/word/2018/wordml" xmlns:w16sdtdh="http://schemas.microsoft.com/office/word/2020/wordml/sdtdatahash" xmlns:w16se="http://schemas.microsoft.com/office/word/2015/wordml/symex" mc:Ignorable="w14 w15 w16se w16cid w16 w16cex w16sdtdh">
   <w:docDefaults>
     <w:rPrDefault>
       <w:rPr>
@@ -6321,7 +6357,7 @@
       </w:pPr>
     </w:pPrDefault>
   </w:docDefaults>
-  <w:latentStyles w:defLockedState="0" w:defUIPriority="99" w:defSemiHidden="0" w:defUnhideWhenUsed="0" w:defQFormat="0" w:count="371">
+  <w:latentStyles w:defLockedState="0" w:defUIPriority="99" w:defSemiHidden="0" w:defUnhideWhenUsed="0" w:defQFormat="0" w:count="376">
     <w:lsdException w:name="Normal" w:uiPriority="0" w:qFormat="1"/>
     <w:lsdException w:name="heading 1" w:uiPriority="9" w:qFormat="1"/>
     <w:lsdException w:name="heading 2" w:semiHidden="1" w:uiPriority="9" w:unhideWhenUsed="1" w:qFormat="1"/>
@@ -6693,6 +6729,11 @@
     <w:lsdException w:name="List Table 5 Dark Accent 6" w:uiPriority="50"/>
     <w:lsdException w:name="List Table 6 Colorful Accent 6" w:uiPriority="51"/>
     <w:lsdException w:name="List Table 7 Colorful Accent 6" w:uiPriority="52"/>
+    <w:lsdException w:name="Mention" w:semiHidden="1" w:unhideWhenUsed="1"/>
+    <w:lsdException w:name="Smart Hyperlink" w:semiHidden="1" w:unhideWhenUsed="1"/>
+    <w:lsdException w:name="Hashtag" w:semiHidden="1" w:unhideWhenUsed="1"/>
+    <w:lsdException w:name="Unresolved Mention" w:semiHidden="1" w:unhideWhenUsed="1"/>
+    <w:lsdException w:name="Smart Link" w:semiHidden="1" w:unhideWhenUsed="1"/>
   </w:latentStyles>
   <w:style w:type="paragraph" w:default="1" w:styleId="Normal">
     <w:name w:val="Normal"/>

</xml_diff>

<commit_message>
desarrollado la función de generar documento de ot al momento de crear OT, corregido el problema de que no se mostraba la ot después de crear ot
</commit_message>
<xml_diff>
--- a/public/templates/template_instalaciones.docx
+++ b/public/templates/template_instalaciones.docx
@@ -75,8 +75,8 @@
         <mc:AlternateContent>
           <mc:Choice Requires="wps">
             <w:drawing>
-              <wp:inline distT="0" distB="0" distL="0" distR="0" wp14:anchorId="6B605570" wp14:editId="61E24716">
-                <wp:extent cx="2293620" cy="228600"/>
+              <wp:inline distT="0" distB="0" distL="0" distR="0" wp14:anchorId="6B605570" wp14:editId="0999EE82">
+                <wp:extent cx="2293620" cy="281305"/>
                 <wp:effectExtent l="0" t="0" r="0" b="0"/>
                 <wp:docPr id="2" name="Textbox 2"/>
                 <wp:cNvGraphicFramePr>
@@ -91,7 +91,7 @@
                       <wps:spPr>
                         <a:xfrm>
                           <a:off x="0" y="0"/>
-                          <a:ext cx="2293620" cy="228600"/>
+                          <a:ext cx="2293620" cy="281305"/>
                         </a:xfrm>
                         <a:prstGeom prst="rect">
                           <a:avLst/>
@@ -131,6 +131,7 @@
                                   <w:pPr>
                                     <w:pStyle w:val="TableParagraph"/>
                                     <w:spacing w:before="41"/>
+                                    <w:ind w:left="184"/>
                                     <w:rPr>
                                       <w:b/>
                                       <w:sz w:val="23"/>
@@ -139,60 +140,9 @@
                                   <w:r>
                                     <w:rPr>
                                       <w:b/>
-                                      <w:w w:val="105"/>
                                       <w:sz w:val="23"/>
                                     </w:rPr>
-                                    <w:t>O.T.</w:t>
-                                  </w:r>
-                                  <w:r>
-                                    <w:rPr>
-                                      <w:b/>
-                                      <w:spacing w:val="-12"/>
-                                      <w:w w:val="105"/>
-                                      <w:sz w:val="23"/>
-                                    </w:rPr>
-                                    <w:t xml:space="preserve"> </w:t>
-                                  </w:r>
-                                  <w:proofErr w:type="spellStart"/>
-                                  <w:r>
-                                    <w:rPr>
-                                      <w:b/>
-                                      <w:w w:val="105"/>
-                                      <w:sz w:val="23"/>
-                                    </w:rPr>
-                                    <w:t>N°</w:t>
-                                  </w:r>
-                                  <w:proofErr w:type="spellEnd"/>
-                                  <w:r>
-                                    <w:rPr>
-                                      <w:b/>
-                                      <w:w w:val="105"/>
-                                      <w:sz w:val="23"/>
-                                    </w:rPr>
-                                    <w:t xml:space="preserve"> </w:t>
-                                  </w:r>
-                                  <w:r>
-                                    <w:rPr>
-                                      <w:b/>
-                                      <w:sz w:val="23"/>
-                                    </w:rPr>
-                                    <w:t>{{</w:t>
-                                  </w:r>
-                                  <w:proofErr w:type="spellStart"/>
-                                  <w:r>
-                                    <w:rPr>
-                                      <w:b/>
-                                      <w:sz w:val="23"/>
-                                    </w:rPr>
-                                    <w:t>numero_ot</w:t>
-                                  </w:r>
-                                  <w:proofErr w:type="spellEnd"/>
-                                  <w:r>
-                                    <w:rPr>
-                                      <w:b/>
-                                      <w:sz w:val="23"/>
-                                    </w:rPr>
-                                    <w:t>}}</w:t>
+                                    <w:t>O.T. N° {{numero_ot}}</w:t>
                                   </w:r>
                                 </w:p>
                               </w:tc>
@@ -204,6 +154,7 @@
                                   <w:pPr>
                                     <w:pStyle w:val="TableParagraph"/>
                                     <w:spacing w:before="31"/>
+                                    <w:ind w:left="456"/>
                                     <w:rPr>
                                       <w:b/>
                                       <w:sz w:val="23"/>
@@ -251,7 +202,7 @@
                 <v:stroke joinstyle="miter"/>
                 <v:path gradientshapeok="t" o:connecttype="rect"/>
               </v:shapetype>
-              <v:shape id="Textbox 2" o:spid="_x0000_s1026" type="#_x0000_t202" style="width:180.6pt;height:18pt;visibility:visible;mso-wrap-style:square;mso-left-percent:-10001;mso-top-percent:-10001;mso-position-horizontal:absolute;mso-position-horizontal-relative:char;mso-position-vertical:absolute;mso-position-vertical-relative:line;mso-left-percent:-10001;mso-top-percent:-10001;v-text-anchor:top" o:gfxdata="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" filled="f" stroked="f">
+              <v:shape id="Textbox 2" o:spid="_x0000_s1026" type="#_x0000_t202" style="width:180.6pt;height:22.15pt;visibility:visible;mso-wrap-style:square;mso-left-percent:-10001;mso-top-percent:-10001;mso-position-horizontal:absolute;mso-position-horizontal-relative:char;mso-position-vertical:absolute;mso-position-vertical-relative:line;mso-left-percent:-10001;mso-top-percent:-10001;v-text-anchor:top" o:gfxdata="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" filled="f" stroked="f">
                 <v:textbox inset="0,0,0,0">
                   <w:txbxContent>
                     <w:tbl>
@@ -286,6 +237,7 @@
                             <w:pPr>
                               <w:pStyle w:val="TableParagraph"/>
                               <w:spacing w:before="41"/>
+                              <w:ind w:left="184"/>
                               <w:rPr>
                                 <w:b/>
                                 <w:sz w:val="23"/>
@@ -294,60 +246,9 @@
                             <w:r>
                               <w:rPr>
                                 <w:b/>
-                                <w:w w:val="105"/>
                                 <w:sz w:val="23"/>
                               </w:rPr>
-                              <w:t>O.T.</w:t>
-                            </w:r>
-                            <w:r>
-                              <w:rPr>
-                                <w:b/>
-                                <w:spacing w:val="-12"/>
-                                <w:w w:val="105"/>
-                                <w:sz w:val="23"/>
-                              </w:rPr>
-                              <w:t xml:space="preserve"> </w:t>
-                            </w:r>
-                            <w:proofErr w:type="spellStart"/>
-                            <w:r>
-                              <w:rPr>
-                                <w:b/>
-                                <w:w w:val="105"/>
-                                <w:sz w:val="23"/>
-                              </w:rPr>
-                              <w:t>N°</w:t>
-                            </w:r>
-                            <w:proofErr w:type="spellEnd"/>
-                            <w:r>
-                              <w:rPr>
-                                <w:b/>
-                                <w:w w:val="105"/>
-                                <w:sz w:val="23"/>
-                              </w:rPr>
-                              <w:t xml:space="preserve"> </w:t>
-                            </w:r>
-                            <w:r>
-                              <w:rPr>
-                                <w:b/>
-                                <w:sz w:val="23"/>
-                              </w:rPr>
-                              <w:t>{{</w:t>
-                            </w:r>
-                            <w:proofErr w:type="spellStart"/>
-                            <w:r>
-                              <w:rPr>
-                                <w:b/>
-                                <w:sz w:val="23"/>
-                              </w:rPr>
-                              <w:t>numero_ot</w:t>
-                            </w:r>
-                            <w:proofErr w:type="spellEnd"/>
-                            <w:r>
-                              <w:rPr>
-                                <w:b/>
-                                <w:sz w:val="23"/>
-                              </w:rPr>
-                              <w:t>}}</w:t>
+                              <w:t>O.T. N° {{numero_ot}}</w:t>
                             </w:r>
                           </w:p>
                         </w:tc>
@@ -359,6 +260,7 @@
                             <w:pPr>
                               <w:pStyle w:val="TableParagraph"/>
                               <w:spacing w:before="31"/>
+                              <w:ind w:left="456"/>
                               <w:rPr>
                                 <w:b/>
                                 <w:sz w:val="23"/>
@@ -418,91 +320,7 @@
         <w:pStyle w:val="Ttulo1"/>
       </w:pPr>
       <w:r>
-        <w:t>ÓRDENES</w:t>
-      </w:r>
-      <w:r>
-        <w:rPr>
-          <w:spacing w:val="-6"/>
-        </w:rPr>
-        <w:t xml:space="preserve"> </w:t>
-      </w:r>
-      <w:r>
-        <w:t>DE</w:t>
-      </w:r>
-      <w:r>
-        <w:rPr>
-          <w:spacing w:val="-3"/>
-        </w:rPr>
-        <w:t xml:space="preserve"> </w:t>
-      </w:r>
-      <w:r>
-        <w:t>TRABAJO</w:t>
-      </w:r>
-      <w:r>
-        <w:rPr>
-          <w:spacing w:val="-3"/>
-        </w:rPr>
-        <w:t xml:space="preserve"> </w:t>
-      </w:r>
-      <w:r>
-        <w:t>-</w:t>
-      </w:r>
-      <w:r>
-        <w:rPr>
-          <w:spacing w:val="-2"/>
-        </w:rPr>
-        <w:t xml:space="preserve"> </w:t>
-      </w:r>
-      <w:r>
-        <w:t>INSTALACIONES</w:t>
-      </w:r>
-      <w:r>
-        <w:rPr>
-          <w:spacing w:val="-4"/>
-        </w:rPr>
-        <w:t xml:space="preserve"> </w:t>
-      </w:r>
-      <w:r>
-        <w:t>NUEVAS</w:t>
-      </w:r>
-      <w:r>
-        <w:rPr>
-          <w:spacing w:val="-4"/>
-        </w:rPr>
-        <w:t xml:space="preserve"> </w:t>
-      </w:r>
-      <w:r>
-        <w:t>Y</w:t>
-      </w:r>
-      <w:r>
-        <w:rPr>
-          <w:spacing w:val="-2"/>
-        </w:rPr>
-        <w:t xml:space="preserve"> </w:t>
-      </w:r>
-      <w:r>
-        <w:t>FACTIBILIDAD</w:t>
-      </w:r>
-      <w:r>
-        <w:rPr>
-          <w:spacing w:val="-3"/>
-        </w:rPr>
-        <w:t xml:space="preserve"> </w:t>
-      </w:r>
-      <w:r>
-        <w:t>DE</w:t>
-      </w:r>
-      <w:r>
-        <w:rPr>
-          <w:spacing w:val="-1"/>
-        </w:rPr>
-        <w:t xml:space="preserve"> </w:t>
-      </w:r>
-      <w:r>
-        <w:rPr>
-          <w:spacing w:val="-2"/>
-        </w:rPr>
-        <w:t>SUMINISTROS</w:t>
+        <w:t>{{titulo}}</w:t>
       </w:r>
     </w:p>
     <w:p>
@@ -1468,45 +1286,15 @@
               <w:spacing w:line="215" w:lineRule="exact"/>
               <w:rPr>
                 <w:sz w:val="18"/>
+                <w:szCs w:val="18"/>
               </w:rPr>
             </w:pPr>
             <w:r>
               <w:rPr>
-                <w:w w:val="105"/>
-                <w:sz w:val="18"/>
-              </w:rPr>
-              <w:t>Adjunto</w:t>
-            </w:r>
-            <w:r>
-              <w:rPr>
-                <w:spacing w:val="-11"/>
-                <w:w w:val="105"/>
-                <w:sz w:val="18"/>
-              </w:rPr>
-              <w:t xml:space="preserve"> </w:t>
-            </w:r>
-            <w:r>
-              <w:rPr>
-                <w:w w:val="105"/>
-                <w:sz w:val="18"/>
-              </w:rPr>
-              <w:t>listado</w:t>
-            </w:r>
-            <w:r>
-              <w:rPr>
-                <w:spacing w:val="-10"/>
-                <w:w w:val="105"/>
-                <w:sz w:val="18"/>
-              </w:rPr>
-              <w:t xml:space="preserve"> </w:t>
-            </w:r>
-            <w:r>
-              <w:rPr>
-                <w:spacing w:val="-5"/>
-                <w:w w:val="105"/>
-                <w:sz w:val="18"/>
-              </w:rPr>
-              <w:t>OT</w:t>
+                <w:sz w:val="18"/>
+                <w:szCs w:val="18"/>
+              </w:rPr>
+              <w:t>{{detalle_fact}}</w:t>
             </w:r>
           </w:p>
           <w:p>
@@ -1515,46 +1303,9 @@
               <w:spacing w:before="27" w:line="189" w:lineRule="exact"/>
               <w:rPr>
                 <w:sz w:val="18"/>
+                <w:szCs w:val="18"/>
               </w:rPr>
             </w:pPr>
-            <w:r>
-              <w:rPr>
-                <w:w w:val="105"/>
-                <w:sz w:val="18"/>
-              </w:rPr>
-              <w:t>por</w:t>
-            </w:r>
-            <w:r>
-              <w:rPr>
-                <w:spacing w:val="-7"/>
-                <w:w w:val="105"/>
-                <w:sz w:val="18"/>
-              </w:rPr>
-              <w:t xml:space="preserve"> </w:t>
-            </w:r>
-            <w:r>
-              <w:rPr>
-                <w:w w:val="105"/>
-                <w:sz w:val="18"/>
-              </w:rPr>
-              <w:t>correo</w:t>
-            </w:r>
-            <w:r>
-              <w:rPr>
-                <w:spacing w:val="-6"/>
-                <w:w w:val="105"/>
-                <w:sz w:val="18"/>
-              </w:rPr>
-              <w:t xml:space="preserve"> </w:t>
-            </w:r>
-            <w:r>
-              <w:rPr>
-                <w:spacing w:val="-2"/>
-                <w:w w:val="105"/>
-                <w:sz w:val="18"/>
-              </w:rPr>
-              <w:t>electrónico</w:t>
-            </w:r>
           </w:p>
         </w:tc>
         <w:tc>
@@ -1798,45 +1549,15 @@
               <w:spacing w:line="215" w:lineRule="exact"/>
               <w:rPr>
                 <w:sz w:val="18"/>
+                <w:szCs w:val="18"/>
               </w:rPr>
             </w:pPr>
             <w:r>
               <w:rPr>
-                <w:w w:val="105"/>
-                <w:sz w:val="18"/>
-              </w:rPr>
-              <w:t>Adjunto</w:t>
-            </w:r>
-            <w:r>
-              <w:rPr>
-                <w:spacing w:val="-11"/>
-                <w:w w:val="105"/>
-                <w:sz w:val="18"/>
-              </w:rPr>
-              <w:t xml:space="preserve"> </w:t>
-            </w:r>
-            <w:r>
-              <w:rPr>
-                <w:w w:val="105"/>
-                <w:sz w:val="18"/>
-              </w:rPr>
-              <w:t>listado</w:t>
-            </w:r>
-            <w:r>
-              <w:rPr>
-                <w:spacing w:val="-10"/>
-                <w:w w:val="105"/>
-                <w:sz w:val="18"/>
-              </w:rPr>
-              <w:t xml:space="preserve"> </w:t>
-            </w:r>
-            <w:r>
-              <w:rPr>
-                <w:spacing w:val="-5"/>
-                <w:w w:val="105"/>
-                <w:sz w:val="18"/>
-              </w:rPr>
-              <w:t>OT</w:t>
+                <w:sz w:val="18"/>
+                <w:szCs w:val="18"/>
+              </w:rPr>
+              <w:t>{{detalle_inst}}</w:t>
             </w:r>
           </w:p>
           <w:p>
@@ -1845,46 +1566,9 @@
               <w:spacing w:before="27" w:line="188" w:lineRule="exact"/>
               <w:rPr>
                 <w:sz w:val="18"/>
+                <w:szCs w:val="18"/>
               </w:rPr>
             </w:pPr>
-            <w:r>
-              <w:rPr>
-                <w:w w:val="105"/>
-                <w:sz w:val="18"/>
-              </w:rPr>
-              <w:t>por</w:t>
-            </w:r>
-            <w:r>
-              <w:rPr>
-                <w:spacing w:val="-7"/>
-                <w:w w:val="105"/>
-                <w:sz w:val="18"/>
-              </w:rPr>
-              <w:t xml:space="preserve"> </w:t>
-            </w:r>
-            <w:r>
-              <w:rPr>
-                <w:w w:val="105"/>
-                <w:sz w:val="18"/>
-              </w:rPr>
-              <w:t>correo</w:t>
-            </w:r>
-            <w:r>
-              <w:rPr>
-                <w:spacing w:val="-6"/>
-                <w:w w:val="105"/>
-                <w:sz w:val="18"/>
-              </w:rPr>
-              <w:t xml:space="preserve"> </w:t>
-            </w:r>
-            <w:r>
-              <w:rPr>
-                <w:spacing w:val="-2"/>
-                <w:w w:val="105"/>
-                <w:sz w:val="18"/>
-              </w:rPr>
-              <w:t>electrónico</w:t>
-            </w:r>
           </w:p>
         </w:tc>
         <w:tc>
@@ -3373,445 +3057,6 @@
           <w:szCs w:val="20"/>
         </w:rPr>
       </w:pPr>
-      <w:r>
-        <w:rPr>
-          <w:w w:val="105"/>
-          <w:sz w:val="20"/>
-          <w:szCs w:val="20"/>
-        </w:rPr>
-        <w:t>Se</w:t>
-      </w:r>
-      <w:r>
-        <w:rPr>
-          <w:spacing w:val="-5"/>
-          <w:w w:val="105"/>
-          <w:sz w:val="20"/>
-          <w:szCs w:val="20"/>
-        </w:rPr>
-        <w:t xml:space="preserve"> </w:t>
-      </w:r>
-      <w:r>
-        <w:rPr>
-          <w:w w:val="105"/>
-          <w:sz w:val="20"/>
-          <w:szCs w:val="20"/>
-        </w:rPr>
-        <w:t>envía</w:t>
-      </w:r>
-      <w:r>
-        <w:rPr>
-          <w:spacing w:val="-7"/>
-          <w:w w:val="105"/>
-          <w:sz w:val="20"/>
-          <w:szCs w:val="20"/>
-        </w:rPr>
-        <w:t xml:space="preserve"> </w:t>
-      </w:r>
-      <w:r>
-        <w:rPr>
-          <w:w w:val="105"/>
-          <w:sz w:val="20"/>
-          <w:szCs w:val="20"/>
-        </w:rPr>
-        <w:t>archivo</w:t>
-      </w:r>
-      <w:r>
-        <w:rPr>
-          <w:spacing w:val="-7"/>
-          <w:w w:val="105"/>
-          <w:sz w:val="20"/>
-          <w:szCs w:val="20"/>
-        </w:rPr>
-        <w:t xml:space="preserve"> </w:t>
-      </w:r>
-      <w:r>
-        <w:rPr>
-          <w:w w:val="105"/>
-          <w:sz w:val="20"/>
-          <w:szCs w:val="20"/>
-        </w:rPr>
-        <w:t>digital</w:t>
-      </w:r>
-      <w:r>
-        <w:rPr>
-          <w:spacing w:val="-6"/>
-          <w:w w:val="105"/>
-          <w:sz w:val="20"/>
-          <w:szCs w:val="20"/>
-        </w:rPr>
-        <w:t xml:space="preserve"> </w:t>
-      </w:r>
-      <w:r>
-        <w:rPr>
-          <w:w w:val="105"/>
-          <w:sz w:val="20"/>
-          <w:szCs w:val="20"/>
-        </w:rPr>
-        <w:t>del</w:t>
-      </w:r>
-      <w:r>
-        <w:rPr>
-          <w:spacing w:val="-6"/>
-          <w:w w:val="105"/>
-          <w:sz w:val="20"/>
-          <w:szCs w:val="20"/>
-        </w:rPr>
-        <w:t xml:space="preserve"> </w:t>
-      </w:r>
-      <w:r>
-        <w:rPr>
-          <w:w w:val="105"/>
-          <w:sz w:val="20"/>
-          <w:szCs w:val="20"/>
-        </w:rPr>
-        <w:t>total</w:t>
-      </w:r>
-      <w:r>
-        <w:rPr>
-          <w:spacing w:val="-6"/>
-          <w:w w:val="105"/>
-          <w:sz w:val="20"/>
-          <w:szCs w:val="20"/>
-        </w:rPr>
-        <w:t xml:space="preserve"> </w:t>
-      </w:r>
-      <w:r>
-        <w:rPr>
-          <w:w w:val="105"/>
-          <w:sz w:val="20"/>
-          <w:szCs w:val="20"/>
-        </w:rPr>
-        <w:t>de</w:t>
-      </w:r>
-      <w:r>
-        <w:rPr>
-          <w:spacing w:val="-6"/>
-          <w:w w:val="105"/>
-          <w:sz w:val="20"/>
-          <w:szCs w:val="20"/>
-        </w:rPr>
-        <w:t xml:space="preserve"> </w:t>
-      </w:r>
-      <w:r>
-        <w:rPr>
-          <w:w w:val="105"/>
-          <w:sz w:val="20"/>
-          <w:szCs w:val="20"/>
-        </w:rPr>
-        <w:t>trabajos</w:t>
-      </w:r>
-      <w:r>
-        <w:rPr>
-          <w:spacing w:val="-5"/>
-          <w:w w:val="105"/>
-          <w:sz w:val="20"/>
-          <w:szCs w:val="20"/>
-        </w:rPr>
-        <w:t xml:space="preserve"> </w:t>
-      </w:r>
-      <w:r>
-        <w:rPr>
-          <w:w w:val="105"/>
-          <w:sz w:val="20"/>
-          <w:szCs w:val="20"/>
-        </w:rPr>
-        <w:t>programados</w:t>
-      </w:r>
-      <w:r>
-        <w:rPr>
-          <w:spacing w:val="-6"/>
-          <w:w w:val="105"/>
-          <w:sz w:val="20"/>
-          <w:szCs w:val="20"/>
-        </w:rPr>
-        <w:t xml:space="preserve"> </w:t>
-      </w:r>
-      <w:r>
-        <w:rPr>
-          <w:w w:val="105"/>
-          <w:sz w:val="20"/>
-          <w:szCs w:val="20"/>
-        </w:rPr>
-        <w:t>por</w:t>
-      </w:r>
-      <w:r>
-        <w:rPr>
-          <w:spacing w:val="-7"/>
-          <w:w w:val="105"/>
-          <w:sz w:val="20"/>
-          <w:szCs w:val="20"/>
-        </w:rPr>
-        <w:t xml:space="preserve"> </w:t>
-      </w:r>
-      <w:r>
-        <w:rPr>
-          <w:w w:val="105"/>
-          <w:sz w:val="20"/>
-          <w:szCs w:val="20"/>
-        </w:rPr>
-        <w:t>correo</w:t>
-      </w:r>
-      <w:r>
-        <w:rPr>
-          <w:spacing w:val="-7"/>
-          <w:w w:val="105"/>
-          <w:sz w:val="20"/>
-          <w:szCs w:val="20"/>
-        </w:rPr>
-        <w:t xml:space="preserve"> </w:t>
-      </w:r>
-      <w:r>
-        <w:rPr>
-          <w:w w:val="105"/>
-          <w:sz w:val="20"/>
-          <w:szCs w:val="20"/>
-        </w:rPr>
-        <w:t>electrónico</w:t>
-      </w:r>
-      <w:r>
-        <w:rPr>
-          <w:spacing w:val="-6"/>
-          <w:w w:val="105"/>
-          <w:sz w:val="20"/>
-          <w:szCs w:val="20"/>
-        </w:rPr>
-        <w:t xml:space="preserve"> </w:t>
-      </w:r>
-      <w:r>
-        <w:rPr>
-          <w:w w:val="105"/>
-          <w:sz w:val="20"/>
-          <w:szCs w:val="20"/>
-        </w:rPr>
-        <w:t>y</w:t>
-      </w:r>
-      <w:r>
-        <w:rPr>
-          <w:spacing w:val="-7"/>
-          <w:w w:val="105"/>
-          <w:sz w:val="20"/>
-          <w:szCs w:val="20"/>
-        </w:rPr>
-        <w:t xml:space="preserve"> </w:t>
-      </w:r>
-      <w:r>
-        <w:rPr>
-          <w:w w:val="105"/>
-          <w:sz w:val="20"/>
-          <w:szCs w:val="20"/>
-        </w:rPr>
-        <w:t>empresa</w:t>
-      </w:r>
-      <w:r>
-        <w:rPr>
-          <w:spacing w:val="-7"/>
-          <w:w w:val="105"/>
-          <w:sz w:val="20"/>
-          <w:szCs w:val="20"/>
-        </w:rPr>
-        <w:t xml:space="preserve"> </w:t>
-      </w:r>
-      <w:r>
-        <w:rPr>
-          <w:w w:val="105"/>
-          <w:sz w:val="20"/>
-          <w:szCs w:val="20"/>
-        </w:rPr>
-        <w:t>Supervisora.</w:t>
-      </w:r>
-      <w:r>
-        <w:rPr>
-          <w:spacing w:val="-6"/>
-          <w:w w:val="105"/>
-          <w:sz w:val="20"/>
-          <w:szCs w:val="20"/>
-        </w:rPr>
-        <w:t xml:space="preserve"> </w:t>
-      </w:r>
-      <w:r>
-        <w:rPr>
-          <w:w w:val="105"/>
-          <w:sz w:val="20"/>
-          <w:szCs w:val="20"/>
-        </w:rPr>
-        <w:t xml:space="preserve">Las </w:t>
-      </w:r>
-      <w:r>
-        <w:rPr>
-          <w:b/>
-          <w:i/>
-          <w:w w:val="105"/>
-          <w:sz w:val="20"/>
-          <w:szCs w:val="20"/>
-        </w:rPr>
-        <w:t>factibilidades</w:t>
-      </w:r>
-      <w:r>
-        <w:rPr>
-          <w:b/>
-          <w:i/>
-          <w:spacing w:val="23"/>
-          <w:w w:val="105"/>
-          <w:sz w:val="20"/>
-          <w:szCs w:val="20"/>
-        </w:rPr>
-        <w:t xml:space="preserve"> </w:t>
-      </w:r>
-      <w:r>
-        <w:rPr>
-          <w:w w:val="105"/>
-          <w:sz w:val="20"/>
-          <w:szCs w:val="20"/>
-        </w:rPr>
-        <w:t>serán</w:t>
-      </w:r>
-      <w:r>
-        <w:rPr>
-          <w:spacing w:val="-6"/>
-          <w:w w:val="105"/>
-          <w:sz w:val="20"/>
-          <w:szCs w:val="20"/>
-        </w:rPr>
-        <w:t xml:space="preserve"> </w:t>
-      </w:r>
-      <w:r>
-        <w:rPr>
-          <w:w w:val="105"/>
-          <w:sz w:val="20"/>
-          <w:szCs w:val="20"/>
-        </w:rPr>
-        <w:t>realizadas</w:t>
-      </w:r>
-      <w:r>
-        <w:rPr>
-          <w:spacing w:val="-5"/>
-          <w:w w:val="105"/>
-          <w:sz w:val="20"/>
-          <w:szCs w:val="20"/>
-        </w:rPr>
-        <w:t xml:space="preserve"> </w:t>
-      </w:r>
-      <w:r>
-        <w:rPr>
-          <w:w w:val="105"/>
-          <w:sz w:val="20"/>
-          <w:szCs w:val="20"/>
-        </w:rPr>
-        <w:t>en</w:t>
-      </w:r>
-      <w:r>
-        <w:rPr>
-          <w:spacing w:val="-6"/>
-          <w:w w:val="105"/>
-          <w:sz w:val="20"/>
-          <w:szCs w:val="20"/>
-        </w:rPr>
-        <w:t xml:space="preserve"> </w:t>
-      </w:r>
-      <w:r>
-        <w:rPr>
-          <w:w w:val="105"/>
-          <w:sz w:val="20"/>
-          <w:szCs w:val="20"/>
-        </w:rPr>
-        <w:t>una</w:t>
-      </w:r>
-      <w:r>
-        <w:rPr>
-          <w:spacing w:val="-7"/>
-          <w:w w:val="105"/>
-          <w:sz w:val="20"/>
-          <w:szCs w:val="20"/>
-        </w:rPr>
-        <w:t xml:space="preserve"> </w:t>
-      </w:r>
-      <w:r>
-        <w:rPr>
-          <w:w w:val="105"/>
-          <w:sz w:val="20"/>
-          <w:szCs w:val="20"/>
-        </w:rPr>
-        <w:t>sola</w:t>
-      </w:r>
-      <w:r>
-        <w:rPr>
-          <w:spacing w:val="-7"/>
-          <w:w w:val="105"/>
-          <w:sz w:val="20"/>
-          <w:szCs w:val="20"/>
-        </w:rPr>
-        <w:t xml:space="preserve"> </w:t>
-      </w:r>
-      <w:r>
-        <w:rPr>
-          <w:w w:val="105"/>
-          <w:sz w:val="20"/>
-          <w:szCs w:val="20"/>
-        </w:rPr>
-        <w:t>visita</w:t>
-      </w:r>
-      <w:r>
-        <w:rPr>
-          <w:spacing w:val="-7"/>
-          <w:w w:val="105"/>
-          <w:sz w:val="20"/>
-          <w:szCs w:val="20"/>
-        </w:rPr>
-        <w:t xml:space="preserve"> </w:t>
-      </w:r>
-      <w:r>
-        <w:rPr>
-          <w:w w:val="105"/>
-          <w:sz w:val="20"/>
-          <w:szCs w:val="20"/>
-        </w:rPr>
-        <w:t>caso contrario se ente</w:t>
-      </w:r>
-      <w:r>
-        <w:rPr>
-          <w:w w:val="105"/>
-          <w:sz w:val="20"/>
-          <w:szCs w:val="20"/>
-        </w:rPr>
-        <w:t>n</w:t>
-      </w:r>
-      <w:r>
-        <w:rPr>
-          <w:w w:val="105"/>
-          <w:sz w:val="20"/>
-          <w:szCs w:val="20"/>
-        </w:rPr>
-        <w:t xml:space="preserve">derá que no están comunicando al usuario correctamente. </w:t>
-      </w:r>
-      <w:r>
-        <w:rPr>
-          <w:b/>
-          <w:i/>
-          <w:w w:val="105"/>
-          <w:sz w:val="20"/>
-          <w:szCs w:val="20"/>
-        </w:rPr>
-        <w:t>Instalaciones Nuevas</w:t>
-      </w:r>
-      <w:r>
-        <w:rPr>
-          <w:b/>
-          <w:i/>
-          <w:spacing w:val="36"/>
-          <w:w w:val="105"/>
-          <w:sz w:val="20"/>
-          <w:szCs w:val="20"/>
-        </w:rPr>
-        <w:t xml:space="preserve"> </w:t>
-      </w:r>
-      <w:r>
-        <w:rPr>
-          <w:w w:val="105"/>
-          <w:sz w:val="20"/>
-          <w:szCs w:val="20"/>
-        </w:rPr>
-        <w:t>coordinar con los usuarios</w:t>
-      </w:r>
     </w:p>
     <w:p>
       <w:pPr>
@@ -3915,7 +3160,6 @@
         </w:rPr>
         <w:t xml:space="preserve"> </w:t>
       </w:r>
-      <w:proofErr w:type="gramStart"/>
       <w:r>
         <w:rPr>
           <w:w w:val="105"/>
@@ -3941,7 +3185,6 @@
         </w:rPr>
         <w:t>programados</w:t>
       </w:r>
-      <w:proofErr w:type="gramEnd"/>
       <w:r>
         <w:rPr>
           <w:spacing w:val="-6"/>
@@ -5686,45 +4929,16 @@
               <w:rPr>
                 <w:b/>
                 <w:sz w:val="19"/>
+                <w:szCs w:val="19"/>
               </w:rPr>
             </w:pPr>
             <w:r>
               <w:rPr>
                 <w:b/>
                 <w:sz w:val="19"/>
-              </w:rPr>
-              <w:t>COORDINADOR</w:t>
-            </w:r>
-            <w:r>
-              <w:rPr>
-                <w:b/>
-                <w:spacing w:val="26"/>
-                <w:sz w:val="19"/>
-              </w:rPr>
-              <w:t xml:space="preserve"> </w:t>
-            </w:r>
-            <w:r>
-              <w:rPr>
-                <w:b/>
-                <w:sz w:val="19"/>
-              </w:rPr>
-              <w:t>"CONSORCIO</w:t>
-            </w:r>
-            <w:r>
-              <w:rPr>
-                <w:b/>
-                <w:spacing w:val="26"/>
-                <w:sz w:val="19"/>
-              </w:rPr>
-              <w:t xml:space="preserve"> </w:t>
-            </w:r>
-            <w:r>
-              <w:rPr>
-                <w:b/>
-                <w:spacing w:val="-2"/>
-                <w:sz w:val="19"/>
-              </w:rPr>
-              <w:t>SUPERVISOR"</w:t>
+                <w:szCs w:val="19"/>
+              </w:rPr>
+              <w:t>{{firma_coordinador}}</w:t>
             </w:r>
           </w:p>
         </w:tc>
@@ -5741,75 +4955,16 @@
               <w:rPr>
                 <w:b/>
                 <w:sz w:val="19"/>
+                <w:szCs w:val="19"/>
               </w:rPr>
             </w:pPr>
             <w:r>
               <w:rPr>
                 <w:b/>
                 <w:sz w:val="19"/>
-              </w:rPr>
-              <w:t>ÁREA</w:t>
-            </w:r>
-            <w:r>
-              <w:rPr>
-                <w:b/>
-                <w:spacing w:val="19"/>
-                <w:sz w:val="19"/>
-              </w:rPr>
-              <w:t xml:space="preserve"> </w:t>
-            </w:r>
-            <w:r>
-              <w:rPr>
-                <w:b/>
-                <w:sz w:val="19"/>
-              </w:rPr>
-              <w:t>USUARIA</w:t>
-            </w:r>
-            <w:r>
-              <w:rPr>
-                <w:b/>
-                <w:spacing w:val="19"/>
-                <w:sz w:val="19"/>
-              </w:rPr>
-              <w:t xml:space="preserve"> </w:t>
-            </w:r>
-            <w:r>
-              <w:rPr>
-                <w:b/>
-                <w:sz w:val="19"/>
-              </w:rPr>
-              <w:t>-</w:t>
-            </w:r>
-            <w:r>
-              <w:rPr>
-                <w:b/>
-                <w:spacing w:val="19"/>
-                <w:sz w:val="19"/>
-              </w:rPr>
-              <w:t xml:space="preserve"> </w:t>
-            </w:r>
-            <w:r>
-              <w:rPr>
-                <w:b/>
-                <w:sz w:val="19"/>
-              </w:rPr>
-              <w:t>ELECTROPUNO</w:t>
-            </w:r>
-            <w:r>
-              <w:rPr>
-                <w:b/>
-                <w:spacing w:val="17"/>
-                <w:sz w:val="19"/>
-              </w:rPr>
-              <w:t xml:space="preserve"> </w:t>
-            </w:r>
-            <w:r>
-              <w:rPr>
-                <w:b/>
-                <w:spacing w:val="-2"/>
-                <w:sz w:val="19"/>
-              </w:rPr>
-              <w:t>S.A.A.</w:t>
+                <w:szCs w:val="19"/>
+              </w:rPr>
+              <w:t>{{firma_area_usuaria}}</w:t>
             </w:r>
           </w:p>
         </w:tc>
@@ -5826,88 +4981,16 @@
               <w:rPr>
                 <w:b/>
                 <w:sz w:val="19"/>
+                <w:szCs w:val="19"/>
               </w:rPr>
             </w:pPr>
             <w:r>
               <w:rPr>
                 <w:b/>
-                <w:spacing w:val="-2"/>
-                <w:w w:val="105"/>
                 <w:sz w:val="19"/>
-              </w:rPr>
-              <w:t>SUPERVISOR</w:t>
-            </w:r>
-            <w:r>
-              <w:rPr>
-                <w:b/>
-                <w:spacing w:val="-3"/>
-                <w:w w:val="105"/>
-                <w:sz w:val="19"/>
-              </w:rPr>
-              <w:t xml:space="preserve"> </w:t>
-            </w:r>
-            <w:r>
-              <w:rPr>
-                <w:b/>
-                <w:spacing w:val="-2"/>
-                <w:w w:val="105"/>
-                <w:sz w:val="19"/>
-              </w:rPr>
-              <w:t>"Consorcio</w:t>
-            </w:r>
-            <w:r>
-              <w:rPr>
-                <w:b/>
-                <w:spacing w:val="-3"/>
-                <w:w w:val="105"/>
-                <w:sz w:val="19"/>
-              </w:rPr>
-              <w:t xml:space="preserve"> </w:t>
-            </w:r>
-            <w:r>
-              <w:rPr>
-                <w:b/>
-                <w:spacing w:val="-2"/>
-                <w:w w:val="105"/>
-                <w:sz w:val="19"/>
-              </w:rPr>
-              <w:t>San Pedro -</w:t>
-            </w:r>
-            <w:r>
-              <w:rPr>
-                <w:b/>
-                <w:spacing w:val="-3"/>
-                <w:w w:val="105"/>
-                <w:sz w:val="19"/>
-              </w:rPr>
-              <w:t xml:space="preserve"> </w:t>
-            </w:r>
-            <w:r>
-              <w:rPr>
-                <w:b/>
-                <w:spacing w:val="-2"/>
-                <w:w w:val="105"/>
-                <w:sz w:val="19"/>
-              </w:rPr>
-              <w:t>ITEM</w:t>
-            </w:r>
-            <w:r>
-              <w:rPr>
-                <w:b/>
-                <w:spacing w:val="-1"/>
-                <w:w w:val="105"/>
-                <w:sz w:val="19"/>
-              </w:rPr>
-              <w:t xml:space="preserve"> </w:t>
-            </w:r>
-            <w:r>
-              <w:rPr>
-                <w:b/>
-                <w:spacing w:val="-5"/>
-                <w:w w:val="105"/>
-                <w:sz w:val="19"/>
-              </w:rPr>
-              <w:t>4"</w:t>
+                <w:szCs w:val="19"/>
+              </w:rPr>
+              <w:t>{{firma_supervisor}}</w:t>
             </w:r>
           </w:p>
         </w:tc>

</xml_diff>

<commit_message>
rediseño de la función de crear nuevo ot
</commit_message>
<xml_diff>
--- a/public/templates/template_instalaciones.docx
+++ b/public/templates/template_instalaciones.docx
@@ -154,7 +154,6 @@
                                   <w:pPr>
                                     <w:pStyle w:val="TableParagraph"/>
                                     <w:spacing w:before="31"/>
-                                    <w:ind w:left="456"/>
                                     <w:rPr>
                                       <w:b/>
                                       <w:sz w:val="23"/>
@@ -260,7 +259,6 @@
                             <w:pPr>
                               <w:pStyle w:val="TableParagraph"/>
                               <w:spacing w:before="31"/>
-                              <w:ind w:left="456"/>
                               <w:rPr>
                                 <w:b/>
                                 <w:sz w:val="23"/>
@@ -735,6 +733,11 @@
       </w:r>
       <w:r>
         <w:tab/>
+      </w:r>
+      <w:r>
+        <w:rPr>
+          <w:color w:val="0000FF"/>
+        </w:rPr>
         <w:t>{{editado_por}}</w:t>
       </w:r>
     </w:p>

</xml_diff>